<commit_message>
Elevate Feishu module in final submission
</commit_message>
<xml_diff>
--- a/提交材料/00_提交信息汇总.docx
+++ b/提交材料/00_提交信息汇总.docx
@@ -390,6 +390,50 @@
           </w:p>
         </w:tc>
       </w:tr>
+      <w:tr>
+        <w:tc>
+          <w:tcPr>
+            <w:tcW w:type="dxa" w:w="3024"/>
+            <w:vAlign w:val="center"/>
+            <w:tcMar>
+              <w:top w:w="90" w:type="dxa"/>
+              <w:start w:w="120" w:type="dxa"/>
+              <w:bottom w:w="90" w:type="dxa"/>
+              <w:end w:w="120" w:type="dxa"/>
+            </w:tcMar>
+          </w:tcPr>
+          <w:p>
+            <w:r>
+              <w:rPr>
+                <w:rFonts w:ascii="Calibri" w:hAnsi="Calibri" w:eastAsia="Microsoft YaHei"/>
+                <w:sz w:val="18"/>
+              </w:rPr>
+              <w:t>07_飞书功能模块说明.docx</w:t>
+            </w:r>
+          </w:p>
+        </w:tc>
+        <w:tc>
+          <w:tcPr>
+            <w:tcW w:type="dxa" w:w="6192"/>
+            <w:vAlign w:val="center"/>
+            <w:tcMar>
+              <w:top w:w="90" w:type="dxa"/>
+              <w:start w:w="120" w:type="dxa"/>
+              <w:bottom w:w="90" w:type="dxa"/>
+              <w:end w:w="120" w:type="dxa"/>
+            </w:tcMar>
+          </w:tcPr>
+          <w:p>
+            <w:r>
+              <w:rPr>
+                <w:rFonts w:ascii="Calibri" w:hAnsi="Calibri" w:eastAsia="Microsoft YaHei"/>
+                <w:sz w:val="18"/>
+              </w:rPr>
+              <w:t>单独说明互动卡片、审批、多维表格、任务、Aily问答与事件回调如何支撑解题。</w:t>
+            </w:r>
+          </w:p>
+        </w:tc>
+      </w:tr>
     </w:tbl>
     <w:p>
       <w:pPr>
@@ -413,6 +457,30 @@
           <w:rFonts w:ascii="Calibri" w:hAnsi="Calibri" w:eastAsia="Microsoft YaHei"/>
         </w:rPr>
         <w:t>本地平台入口：D:\云图-合成氨-邓植斤\index.html</w:t>
+      </w:r>
+    </w:p>
+    <w:p>
+      <w:r>
+        <w:rPr>
+          <w:rFonts w:ascii="Calibri" w:hAnsi="Calibri" w:eastAsia="Microsoft YaHei"/>
+        </w:rPr>
+        <w:t>飞书在线完整方案稿：https://www.feishu.cn/docx/AYyad50itooOPxxZpQacgSqIn2c</w:t>
+      </w:r>
+    </w:p>
+    <w:p>
+      <w:r>
+        <w:rPr>
+          <w:rFonts w:ascii="Calibri" w:hAnsi="Calibri" w:eastAsia="Microsoft YaHei"/>
+        </w:rPr>
+        <w:t>飞书Base调度复盘库原型：https://www.feishu.cn/base/QzENbAkl1aYQGds8dBacqu6Inue</w:t>
+      </w:r>
+    </w:p>
+    <w:p>
+      <w:r>
+        <w:rPr>
+          <w:rFonts w:ascii="Calibri" w:hAnsi="Calibri" w:eastAsia="Microsoft YaHei"/>
+        </w:rPr>
+        <w:t>飞书任务清单：https://applink.feishu.cn/client/todo/task_list?guid=2ab6c357-dfeb-4f75-9aa3-781dc7ac7244</w:t>
       </w:r>
     </w:p>
     <w:sectPr>

</xml_diff>

<commit_message>
Refocus final project around supply chain dispatch
</commit_message>
<xml_diff>
--- a/提交材料/00_提交信息汇总.docx
+++ b/提交材料/00_提交信息汇总.docx
@@ -43,7 +43,7 @@
         <w:rPr>
           <w:rFonts w:ascii="Calibri" w:hAnsi="Calibri" w:eastAsia="Microsoft YaHei"/>
         </w:rPr>
-        <w:t>本命题考察的不是再造一块展示看板，而是在合成氨硬件单位成本已接近极限后，能否用AI把运行管理中的“软件成本”继续压低。云图应城合成氨装置连接尿素溶液、复合肥、联碱配套、液氨库存与外售，调度同时受合成塔床层温升、氢氮比、循环压缩机、罐区安全库存、能源价格、下游订单和设备健康约束。真正有价值的方案应能进入班组日常：实时感知、多方案寻优、解释安全边界、推动确认执行、沉淀采纳与未采纳原因，逐步形成可传承的合成氨调度知识资产。（约210字）</w:t>
+        <w:t>本命题真正考察的不是再做一块合成氨看板，而是能否把产供销、装置负荷、能源、公辅、设备和班组经验贯通成一个可执行的数字调度长。企业反馈已把方向收束清楚：第一优先级是液氨有限、下游需求和市场价格变化时的产供销协同与跨装置负荷联动；第二优先级是在稳定生产中吸收下游、能源、库存波动，避免冲击主流程；第三优先级是压缩机、机组、合成塔等弱信号提前预警；底座是把调度长多年经验沉淀给新人复用。方案价值不在替代DCS，而在打通系统孤岛、解释取舍、推动执行和形成知识资产。（约228字）</w:t>
       </w:r>
     </w:p>
     <w:p>
@@ -59,7 +59,7 @@
         <w:rPr>
           <w:rFonts w:ascii="Calibri" w:hAnsi="Calibri" w:eastAsia="Microsoft YaHei"/>
         </w:rPr>
-        <w:t>本方案建设“氨智领航调控师”，定位为合成氨当班调度副驾驶。平台先以30天打通MES日计划、ERP订单、DCS historian摘要、液氨罐区、EAM点检、能源价格与飞书协同记录，形成班次事实表；60天进入影子运行，滚动输出稳氨、保供、护机三案，每案列明目标负荷、下游分配、吨氨边际成本、风险指数、审批路径和回滚条件；90天只在低风险场景做小闭环验收。模型层采用机理约束+RTO经济目标+APC/MPC连续负荷建议+PINN反应器校准的组合，确保算法能与企业现有控制体系对话。组织层接入飞书互动卡片、审批、多维表格和班后复盘，保留谁确认、谁驳回、为何采纳、执行偏差如何的完整链路。知识层把每次实际方案、未采纳原因、床层温升异常、氢氮比偏差、压缩机健康变化和收益核算沉淀为知识库，周度校准模型与规则。平台不直接修改DCS/SIS控制逻辑，不自动开停车；低置信、数据延迟、安环红线接近时自动降级人工流程。（约400字）</w:t>
+        <w:t>本方案建设“氨智领航调控师”，定位为合成氨产供销联动数字员工。30天先打通MES/合成氨调控平台、IoT、DCS摘要、热电APC、压机/机组数据、液氨库存、下游订单、市场行情和飞书记录，形成全线事实表；60天影子运行，围绕产供销协同、稳产波动吸收、设备弱信号预警三类场景输出可解释方案；90天只在低风险场景小闭环验收。主赛道按边际贡献、固定成本吸收、液氨机会成本、停开成本和流程连续性判断“保谁、降谁、停谁、是否外采”；第二赛道在下游需求、能源、公辅、库存波动时给出跨装置负荷节奏，避免主流程被动中断；支撑底座把采纳、驳回、事故复盘、未采纳原因和班长经验沉淀为知识库和新人训练样本。平台不直接修改DCS/SIS控制逻辑，不自动开停车；低置信、数据延迟、安环红线接近时自动降级人工流程，并通过飞书卡片、审批、任务和Base复盘留痕。（约365字）</w:t>
       </w:r>
     </w:p>
     <w:p>

</xml_diff>

<commit_message>
feat: prepare finals-grade ammonia dispatch delivery
</commit_message>
<xml_diff>
--- a/提交材料/00_提交信息汇总.docx
+++ b/提交材料/00_提交信息汇总.docx
@@ -27,7 +27,7 @@
           <w:color w:val="5A6976"/>
           <w:sz w:val="21"/>
         </w:rPr>
-        <w:t>用于在线表单填写与附件核对</w:t>
+        <w:t>在线表单填写索引、附件用途与体验链接</w:t>
       </w:r>
     </w:p>
     <w:p>
@@ -43,7 +43,7 @@
         <w:rPr>
           <w:rFonts w:ascii="Calibri" w:hAnsi="Calibri" w:eastAsia="Microsoft YaHei"/>
         </w:rPr>
-        <w:t>本命题真正考察的不是再做一块合成氨看板，而是能否把产供销、装置负荷、能源、公辅、设备和班组经验贯通成一个可执行的数字调度长。企业反馈已把方向收束清楚：第一优先级是液氨有限、下游需求和市场价格变化时的产供销协同与跨装置负荷联动；第二优先级是在稳定生产中吸收下游、能源、库存波动，避免冲击主流程；第三优先级是压缩机、机组、合成塔等弱信号提前预警；底座是把调度长多年经验沉淀给新人复用。方案价值不在替代DCS，而在打通系统孤岛、解释取舍、推动执行和形成知识资产。（约228字）</w:t>
+        <w:t>我们将课题界定为班次级生产调度问题：在安全和连续生产约束下，综合液氨库存、下游需求、订单、价格、公用工程和设备状态，确定液氨分配、装置负荷、外采安排及必要的停运评估。平台连接现有系统的数据和班组流程，不替代DCS/SIS；同时记录方案、确认、执行和复盘，使调度经验能够被检索和复用。首批范围聚焦产供销协同，稳定运行提示和关键设备趋势异常作为辅助能力。（约175字）</w:t>
       </w:r>
     </w:p>
     <w:p>
@@ -59,7 +59,7 @@
         <w:rPr>
           <w:rFonts w:ascii="Calibri" w:hAnsi="Calibri" w:eastAsia="Microsoft YaHei"/>
         </w:rPr>
-        <w:t>本方案建设“氨智领航调控师”，定位为合成氨产供销联动数字员工。30天先打通MES/合成氨调控平台、IoT、DCS摘要、热电APC、压机/机组数据、液氨库存、下游订单、市场行情和飞书记录，形成全线事实表；60天影子运行，围绕产供销协同、稳产波动吸收、设备弱信号预警三类场景输出可解释方案；90天只在低风险场景小闭环验收。主赛道按边际贡献、固定成本吸收、液氨机会成本、停开成本和流程连续性判断“保谁、降谁、停谁、是否外采”；第二赛道在下游需求、能源、公辅、库存波动时给出跨装置负荷节奏，避免主流程被动中断；支撑底座把采纳、驳回、事故复盘、未采纳原因和班长经验沉淀为知识库和新人训练样本。平台不直接修改DCS/SIS控制逻辑，不自动开停车；低置信、数据延迟、安环红线接近时自动降级人工流程，并通过飞书卡片、审批、任务和Base复盘留痕。（约365字）</w:t>
+        <w:t>我们建设“氨智领航调控师”，采用“事实汇总、约束校核、方案比较、人工审批、执行跟踪、班后复盘”六步流程。首先校核ERP订单导出、MES班次计划、罐区历史摘要和飞书协同记录四类离线或只读数据，形成带来源、时间戳和质量码的班次调度事实表。优化模块以安全、连续生产和设备限制为硬约束，按照液氨机会成本、非氨变动成本、物流、启停损失和违约风险比较下游分配方案，输出目标负荷、有效期、触发依据和撤销条件。建议经飞书卡片送达班组；设备趋势或安全边界触发时强制主管及相关专业会签，批准后仅写入MES计划摘要并建立跟踪任务，不写DCS/SIS。班后记录实际负荷、库存、能耗和未采纳原因，候选规则经专业人员审核后再入库。试点分三步实施：30天完成四类离线或只读数据的口径校核和接口清单，60天扩展生产历史数据库、设备和公用工程只读数据并开展旁路回放，90天选择低风险场景进行执行验证。（约383字）</w:t>
       </w:r>
     </w:p>
     <w:p>
@@ -144,7 +144,7 @@
                 <w:rFonts w:ascii="Calibri" w:hAnsi="Calibri" w:eastAsia="Microsoft YaHei"/>
                 <w:sz w:val="18"/>
               </w:rPr>
-              <w:t>01_开题报告.docx</w:t>
+              <w:t>01_开题报告_决赛更新稿.docx</w:t>
             </w:r>
           </w:p>
         </w:tc>
@@ -165,7 +165,7 @@
                 <w:rFonts w:ascii="Calibri" w:hAnsi="Calibri" w:eastAsia="Microsoft YaHei"/>
                 <w:sz w:val="18"/>
               </w:rPr>
-              <w:t>在线表单两个必填文本框的完整版本。</w:t>
+              <w:t>开题报告定稿，集中回答命题理解、方案思路和资料依据。</w:t>
             </w:r>
           </w:p>
         </w:tc>
@@ -209,7 +209,7 @@
                 <w:rFonts w:ascii="Calibri" w:hAnsi="Calibri" w:eastAsia="Microsoft YaHei"/>
                 <w:sz w:val="18"/>
               </w:rPr>
-              <w:t>系统架构、APC/RTO接口、试点路径与验收边界。</w:t>
+              <w:t>系统实施方案，说明业务流程、数据接口、约束模型、部署边界、试点步骤和验收方法。</w:t>
             </w:r>
           </w:p>
         </w:tc>
@@ -253,7 +253,7 @@
                 <w:rFonts w:ascii="Calibri" w:hAnsi="Calibri" w:eastAsia="Microsoft YaHei"/>
                 <w:sz w:val="18"/>
               </w:rPr>
-              <w:t>班组如何使用平台、飞书协同和异常降级。</w:t>
+              <w:t>班组使用手册，说明调度员、班长和专业人员在班前、班中、班后的具体操作。</w:t>
             </w:r>
           </w:p>
         </w:tc>
@@ -297,7 +297,7 @@
                 <w:rFonts w:ascii="Calibri" w:hAnsi="Calibri" w:eastAsia="Microsoft YaHei"/>
                 <w:sz w:val="18"/>
               </w:rPr>
-              <w:t>公司资料、行业资料、合成氨控制优化与安全依据。</w:t>
+              <w:t>证据来源与口径说明，记录事实来源、使用位置、适用边界及仍需企业确认的数据。</w:t>
             </w:r>
           </w:p>
         </w:tc>
@@ -341,7 +341,7 @@
                 <w:rFonts w:ascii="Calibri" w:hAnsi="Calibri" w:eastAsia="Microsoft YaHei"/>
                 <w:sz w:val="18"/>
               </w:rPr>
-              <w:t>关键创新点、现有交付状态和上线清单。</w:t>
+              <w:t>交付状态与试点验收清单，区分已验证、演示原型、待授权和试点工作。</w:t>
             </w:r>
           </w:p>
         </w:tc>
@@ -385,7 +385,7 @@
                 <w:rFonts w:ascii="Calibri" w:hAnsi="Calibri" w:eastAsia="Microsoft YaHei"/>
                 <w:sz w:val="18"/>
               </w:rPr>
-              <w:t>按飞书模板结构组织的信息卡与完整方案。</w:t>
+              <w:t>参赛方案主文档，用典型班次串联问题、平台操作、飞书协同、结果复核和实施计划。</w:t>
             </w:r>
           </w:p>
         </w:tc>
@@ -429,7 +429,7 @@
                 <w:rFonts w:ascii="Calibri" w:hAnsi="Calibri" w:eastAsia="Microsoft YaHei"/>
                 <w:sz w:val="18"/>
               </w:rPr>
-              <w:t>单独说明互动卡片、审批、多维表格、任务、Aily问答与事件回调如何支撑解题。</w:t>
+              <w:t>飞书协同与接口说明，说明卡片、审批、Task v2、多维表格、智能问答和事件回传。</w:t>
             </w:r>
           </w:p>
         </w:tc>
@@ -481,6 +481,14 @@
           <w:rFonts w:ascii="Calibri" w:hAnsi="Calibri" w:eastAsia="Microsoft YaHei"/>
         </w:rPr>
         <w:t>飞书任务清单：https://applink.feishu.cn/client/todo/task_list?guid=2ab6c357-dfeb-4f75-9aa3-781dc7ac7244</w:t>
+      </w:r>
+    </w:p>
+    <w:p>
+      <w:r>
+        <w:rPr>
+          <w:rFonts w:ascii="Calibri" w:hAnsi="Calibri" w:eastAsia="Microsoft YaHei"/>
+        </w:rPr>
+        <w:t>飞书Task v2验收任务：https://applink.feishu.cn/client/todo/detail?guid=44631b59-b834-47b1-a413-b751f2f291da&amp;suite_entity_num=t136777</w:t>
       </w:r>
     </w:p>
     <w:sectPr>

</xml_diff>

<commit_message>
feat: harden finals dispatch validation workflow
</commit_message>
<xml_diff>
--- a/提交材料/00_提交信息汇总.docx
+++ b/提交材料/00_提交信息汇总.docx
@@ -59,7 +59,7 @@
         <w:rPr>
           <w:rFonts w:ascii="Calibri" w:hAnsi="Calibri" w:eastAsia="Microsoft YaHei"/>
         </w:rPr>
-        <w:t>我们建设“氨智领航调控师”，采用“事实汇总、约束校核、方案比较、人工审批、执行跟踪、班后复盘”六步流程。首先校核ERP订单导出、MES班次计划、罐区历史摘要和飞书协同记录四类离线或只读数据，形成带来源、时间戳和质量码的班次调度事实表。优化模块以安全、连续生产和设备限制为硬约束，按照液氨机会成本、非氨变动成本、物流、启停损失和违约风险比较下游分配方案，输出目标负荷、有效期、触发依据和撤销条件。建议经飞书卡片送达班组；设备趋势或安全边界触发时强制主管及相关专业会签，批准后仅写入MES计划摘要并建立跟踪任务，不写DCS/SIS。班后记录实际负荷、库存、能耗和未采纳原因，候选规则经专业人员审核后再入库。试点分三步实施：30天完成四类离线或只读数据的口径校核和接口清单，60天扩展生产历史数据库、设备和公用工程只读数据并开展旁路回放，90天选择低风险场景进行执行验证。（约383字）</w:t>
+        <w:t>我们建设“氨智领航调控师”，采用“事实汇总、约束校核、方案比较、人工确认、岗位接令、执行跟踪、班后复盘”流程。首先校核ERP订单导出、MES班次计划、罐区历史摘要和飞书协同记录四类离线或只读数据，形成带来源、时间戳和质量码的班次调度事实表。审批不由汇总分数驱动：一般偏差只提示，设备、公辅、库存等明确条件触发相关专业会签；命中演练停算线时停止新目标、经济排序、动作单和审批，维持最近批准方案并转现场规程。审批后由合成主操、硝酸主操、罐区/调度和公辅调度分别接令，全部接令后才进入执行跟踪，不写DCS/SIS。接令不等于实际执行，无Historian回传时实际值为空。班后记录执行偏差和未采纳原因，候选规则经专业人员审核后再入库。试点分三步实施：30天完成四类离线或只读数据的口径校核和接口清单，60天扩展生产历史数据库、设备和公用工程只读数据并开展旁路回放，90天选择条件完整且未命中停算线的场景进行执行验证。（约405字）</w:t>
       </w:r>
     </w:p>
     <w:p>
@@ -144,7 +144,7 @@
                 <w:rFonts w:ascii="Calibri" w:hAnsi="Calibri" w:eastAsia="Microsoft YaHei"/>
                 <w:sz w:val="18"/>
               </w:rPr>
-              <w:t>01_开题报告_决赛更新稿.docx</w:t>
+              <w:t>01_开题报告.docx</w:t>
             </w:r>
           </w:p>
         </w:tc>
@@ -341,7 +341,7 @@
                 <w:rFonts w:ascii="Calibri" w:hAnsi="Calibri" w:eastAsia="Microsoft YaHei"/>
                 <w:sz w:val="18"/>
               </w:rPr>
-              <w:t>交付状态与试点验收清单，区分已验证、演示原型、待授权和试点工作。</w:t>
+              <w:t>交付状态与试点验收清单，区分已验证、原型、待授权和试点工作。</w:t>
             </w:r>
           </w:p>
         </w:tc>
@@ -430,6 +430,50 @@
                 <w:sz w:val="18"/>
               </w:rPr>
               <w:t>飞书协同与接口说明，说明卡片、审批、Task v2、多维表格、智能问答和事件回传。</w:t>
+            </w:r>
+          </w:p>
+        </w:tc>
+      </w:tr>
+      <w:tr>
+        <w:tc>
+          <w:tcPr>
+            <w:tcW w:type="dxa" w:w="3024"/>
+            <w:vAlign w:val="center"/>
+            <w:tcMar>
+              <w:top w:w="90" w:type="dxa"/>
+              <w:start w:w="120" w:type="dxa"/>
+              <w:bottom w:w="90" w:type="dxa"/>
+              <w:end w:w="120" w:type="dxa"/>
+            </w:tcMar>
+          </w:tcPr>
+          <w:p>
+            <w:r>
+              <w:rPr>
+                <w:rFonts w:ascii="Calibri" w:hAnsi="Calibri" w:eastAsia="Microsoft YaHei"/>
+                <w:sz w:val="18"/>
+              </w:rPr>
+              <w:t>08_决赛演示与验收附件.docx</w:t>
+            </w:r>
+          </w:p>
+        </w:tc>
+        <w:tc>
+          <w:tcPr>
+            <w:tcW w:type="dxa" w:w="6192"/>
+            <w:vAlign w:val="center"/>
+            <w:tcMar>
+              <w:top w:w="90" w:type="dxa"/>
+              <w:start w:w="120" w:type="dxa"/>
+              <w:bottom w:w="90" w:type="dxa"/>
+              <w:end w:w="120" w:type="dxa"/>
+            </w:tcMar>
+          </w:tcPr>
+          <w:p>
+            <w:r>
+              <w:rPr>
+                <w:rFonts w:ascii="Calibri" w:hAnsi="Calibri" w:eastAsia="Microsoft YaHei"/>
+                <w:sz w:val="18"/>
+              </w:rPr>
+              <w:t>现场演示与答辩附件，包含五分钟脚本、班次证据链、跨装置动作单、事实问答、试点数据清单和验收口径。</w:t>
             </w:r>
           </w:p>
         </w:tc>

</xml_diff>